<commit_message>
Update resume with portfolio link
</commit_message>
<xml_diff>
--- a/public/resume/Mahipalsinh-Kavithiya-Resume.docx
+++ b/public/resume/Mahipalsinh-Kavithiya-Resume.docx
@@ -42,6 +42,24 @@
           <w:t xml:space="preserve">github.com/MahipalsinhKavithiya</w:t>
         </w:r>
       </w:hyperlink>
+      <w:r>
+        <w:rPr>
+          <w:sz w:val="19"/>
+        </w:rPr>
+        <w:t xml:space="preserve">  |  </w:t>
+      </w:r>
+      <w:hyperlink r:id="rId7">
+        <w:r>
+          <w:rPr>
+            <w:rFonts w:ascii="Aptos" w:hAnsi="Aptos"/>
+            <w:sz w:val="19"/>
+            <w:szCs w:val="19"/>
+            <w:color w:val="0563C1"/>
+            <w:u w:val="single"/>
+          </w:rPr>
+          <w:t>mahipalsinh-portfolio.vercel.app</w:t>
+        </w:r>
+      </w:hyperlink>
     </w:p>
     <w:p>
       <w:pPr>
@@ -51,12 +69,8 @@
       <w:r>
         <w:rPr>
           <w:i/>
-          <w:iCs/>
-          <w:color w:val="1F3864"/>
-          <w:sz w:val="20"/>
-          <w:szCs w:val="20"/>
-        </w:rPr>
-        <w:t xml:space="preserve">Python Backend Developer | FastAPI | PostgreSQL | REST APIs | AI Integration</w:t>
+        </w:rPr>
+        <w:t>Backend Developer | AI Integration</w:t>
       </w:r>
     </w:p>
     <w:p>

</xml_diff>